<commit_message>
proposal document answer refactor
</commit_message>
<xml_diff>
--- a/Game and Music Store Docs/sw4-FYP-ProjectProposal.docx
+++ b/Game and Music Store Docs/sw4-FYP-ProjectProposal.docx
@@ -99,27 +99,7 @@
           <w:sz w:val="22"/>
           <w:szCs w:val="22"/>
         </w:rPr>
-        <w:t xml:space="preserve">Each student must complete the following form and submit it to their supervisor for consideration. Once your supervisor has </w:t>
-      </w:r>
-      <w:proofErr w:type="gramStart"/>
-      <w:r>
-        <w:rPr>
-          <w:b/>
-          <w:color w:val="0432FF"/>
-          <w:sz w:val="22"/>
-          <w:szCs w:val="22"/>
-        </w:rPr>
-        <w:t>signed-off</w:t>
-      </w:r>
-      <w:proofErr w:type="gramEnd"/>
-      <w:r>
-        <w:rPr>
-          <w:b/>
-          <w:color w:val="0432FF"/>
-          <w:sz w:val="22"/>
-          <w:szCs w:val="22"/>
-        </w:rPr>
-        <w:t xml:space="preserve"> on the proposal, you must submit the document for consideration using Moodle.</w:t>
+        <w:t>Each student must complete the following form and submit it to their supervisor for consideration. Once your supervisor has signed-off on the proposal, you must submit the document for consideration using Moodle.</w:t>
       </w:r>
     </w:p>
     <w:p>
@@ -379,13 +359,73 @@
                               <w:rPr>
                                 <w:color w:val="000000"/>
                               </w:rPr>
-                              <w:t xml:space="preserve"> employee will be able to view orders which will involve tracking customer transactions. A manager will be able to view available stock and sold </w:t>
-                            </w:r>
-                            <w:r>
-                              <w:rPr>
-                                <w:color w:val="000000"/>
-                              </w:rPr>
-                              <w:t>products. The</w:t>
+                              <w:t xml:space="preserve"> employee will be able to view orders which will involve tracking customer transactions</w:t>
+                            </w:r>
+                            <w:r>
+                              <w:rPr>
+                                <w:color w:val="000000"/>
+                              </w:rPr>
+                              <w:t xml:space="preserve"> like games </w:t>
+                            </w:r>
+                            <w:r>
+                              <w:rPr>
+                                <w:color w:val="000000"/>
+                              </w:rPr>
+                              <w:t xml:space="preserve">and/or music </w:t>
+                            </w:r>
+                            <w:r>
+                              <w:rPr>
+                                <w:color w:val="000000"/>
+                              </w:rPr>
+                              <w:t>bought</w:t>
+                            </w:r>
+                            <w:r>
+                              <w:rPr>
+                                <w:color w:val="000000"/>
+                              </w:rPr>
+                              <w:t>. A</w:t>
+                            </w:r>
+                            <w:r>
+                              <w:rPr>
+                                <w:color w:val="000000"/>
+                              </w:rPr>
+                              <w:t xml:space="preserve"> manager will be able </w:t>
+                            </w:r>
+                            <w:r>
+                              <w:rPr>
+                                <w:color w:val="000000"/>
+                              </w:rPr>
+                              <w:t>to view available stock</w:t>
+                            </w:r>
+                            <w:r>
+                              <w:rPr>
+                                <w:color w:val="000000"/>
+                              </w:rPr>
+                              <w:t xml:space="preserve">, </w:t>
+                            </w:r>
+                            <w:r>
+                              <w:rPr>
+                                <w:color w:val="000000"/>
+                              </w:rPr>
+                              <w:t xml:space="preserve">sold </w:t>
+                            </w:r>
+                            <w:r>
+                              <w:rPr>
+                                <w:color w:val="000000"/>
+                              </w:rPr>
+                              <w:t>product</w:t>
+                            </w:r>
+                            <w:r>
+                              <w:rPr>
+                                <w:color w:val="000000"/>
+                              </w:rPr>
+                              <w:t xml:space="preserve">s and customer summary. </w:t>
+                            </w:r>
+                            <w:r>
+                              <w:rPr>
+                                <w:color w:val="000000"/>
+                              </w:rPr>
+                              <w:t>The</w:t>
                             </w:r>
                             <w:r>
                               <w:rPr>
@@ -415,7 +455,19 @@
                               <w:rPr>
                                 <w:color w:val="000000"/>
                               </w:rPr>
-                              <w:t xml:space="preserve"> so I create something I </w:t>
+                              <w:t xml:space="preserve"> so I </w:t>
+                            </w:r>
+                            <w:r>
+                              <w:rPr>
+                                <w:color w:val="000000"/>
+                              </w:rPr>
+                              <w:t xml:space="preserve">can </w:t>
+                            </w:r>
+                            <w:r>
+                              <w:rPr>
+                                <w:color w:val="000000"/>
+                              </w:rPr>
+                              <w:t xml:space="preserve">create something I </w:t>
                             </w:r>
                             <w:r>
                               <w:rPr>
@@ -443,7 +495,7 @@
           </mc:Choice>
           <mc:Fallback>
             <w:pict>
-              <v:rect w14:anchorId="4523B21D" id="Rectangle 829100412" o:spid="_x0000_s1026" style="position:absolute;margin-left:36.55pt;margin-top:4.95pt;width:474.65pt;height:327pt;z-index:251658240;visibility:visible;mso-wrap-style:square;mso-wrap-distance-left:9pt;mso-wrap-distance-top:0;mso-wrap-distance-right:9pt;mso-wrap-distance-bottom:0;mso-position-horizontal:absolute;mso-position-horizontal-relative:text;mso-position-vertical:absolute;mso-position-vertical-relative:text;v-text-anchor:top" o:gfxdata="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" fillcolor="white [3201]" strokecolor="#c00000">
+              <v:rect w14:anchorId="4523B21D" id="Rectangle 829100412" o:spid="_x0000_s1026" style="position:absolute;margin-left:36.55pt;margin-top:4.95pt;width:474.65pt;height:327pt;z-index:251658240;visibility:visible;mso-wrap-style:square;mso-wrap-distance-left:9pt;mso-wrap-distance-top:0;mso-wrap-distance-right:9pt;mso-wrap-distance-bottom:0;mso-position-horizontal:absolute;mso-position-horizontal-relative:text;mso-position-vertical:absolute;mso-position-vertical-relative:text;v-text-anchor:top" o:gfxdata="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" fillcolor="white [3201]" strokecolor="#c00000">
                 <v:stroke startarrowwidth="narrow" startarrowlength="short" endarrowwidth="narrow" endarrowlength="short" joinstyle="round"/>
                 <v:textbox inset="2.53958mm,1.2694mm,2.53958mm,1.2694mm">
                   <w:txbxContent>
@@ -491,13 +543,73 @@
                         <w:rPr>
                           <w:color w:val="000000"/>
                         </w:rPr>
-                        <w:t xml:space="preserve"> employee will be able to view orders which will involve tracking customer transactions. A manager will be able to view available stock and sold </w:t>
-                      </w:r>
-                      <w:r>
-                        <w:rPr>
-                          <w:color w:val="000000"/>
-                        </w:rPr>
-                        <w:t>products. The</w:t>
+                        <w:t xml:space="preserve"> employee will be able to view orders which will involve tracking customer transactions</w:t>
+                      </w:r>
+                      <w:r>
+                        <w:rPr>
+                          <w:color w:val="000000"/>
+                        </w:rPr>
+                        <w:t xml:space="preserve"> like games </w:t>
+                      </w:r>
+                      <w:r>
+                        <w:rPr>
+                          <w:color w:val="000000"/>
+                        </w:rPr>
+                        <w:t xml:space="preserve">and/or music </w:t>
+                      </w:r>
+                      <w:r>
+                        <w:rPr>
+                          <w:color w:val="000000"/>
+                        </w:rPr>
+                        <w:t>bought</w:t>
+                      </w:r>
+                      <w:r>
+                        <w:rPr>
+                          <w:color w:val="000000"/>
+                        </w:rPr>
+                        <w:t>. A</w:t>
+                      </w:r>
+                      <w:r>
+                        <w:rPr>
+                          <w:color w:val="000000"/>
+                        </w:rPr>
+                        <w:t xml:space="preserve"> manager will be able </w:t>
+                      </w:r>
+                      <w:r>
+                        <w:rPr>
+                          <w:color w:val="000000"/>
+                        </w:rPr>
+                        <w:t>to view available stock</w:t>
+                      </w:r>
+                      <w:r>
+                        <w:rPr>
+                          <w:color w:val="000000"/>
+                        </w:rPr>
+                        <w:t xml:space="preserve">, </w:t>
+                      </w:r>
+                      <w:r>
+                        <w:rPr>
+                          <w:color w:val="000000"/>
+                        </w:rPr>
+                        <w:t xml:space="preserve">sold </w:t>
+                      </w:r>
+                      <w:r>
+                        <w:rPr>
+                          <w:color w:val="000000"/>
+                        </w:rPr>
+                        <w:t>product</w:t>
+                      </w:r>
+                      <w:r>
+                        <w:rPr>
+                          <w:color w:val="000000"/>
+                        </w:rPr>
+                        <w:t xml:space="preserve">s and customer summary. </w:t>
+                      </w:r>
+                      <w:r>
+                        <w:rPr>
+                          <w:color w:val="000000"/>
+                        </w:rPr>
+                        <w:t>The</w:t>
                       </w:r>
                       <w:r>
                         <w:rPr>
@@ -527,7 +639,19 @@
                         <w:rPr>
                           <w:color w:val="000000"/>
                         </w:rPr>
-                        <w:t xml:space="preserve"> so I create something I </w:t>
+                        <w:t xml:space="preserve"> so I </w:t>
+                      </w:r>
+                      <w:r>
+                        <w:rPr>
+                          <w:color w:val="000000"/>
+                        </w:rPr>
+                        <w:t xml:space="preserve">can </w:t>
+                      </w:r>
+                      <w:r>
+                        <w:rPr>
+                          <w:color w:val="000000"/>
+                        </w:rPr>
+                        <w:t xml:space="preserve">create something I </w:t>
                       </w:r>
                       <w:r>
                         <w:rPr>
@@ -590,7 +714,6 @@
           <w:b/>
           <w:color w:val="C00000"/>
         </w:rPr>
-        <w:lastRenderedPageBreak/>
         <w:t>Project Objectives</w:t>
       </w:r>
     </w:p>
@@ -618,7 +741,7 @@
         <mc:AlternateContent>
           <mc:Choice Requires="wps">
             <w:drawing>
-              <wp:anchor distT="0" distB="0" distL="114300" distR="114300" simplePos="0" relativeHeight="251659264" behindDoc="0" locked="0" layoutInCell="1" hidden="0" allowOverlap="1" wp14:anchorId="71D7C248" wp14:editId="7D453EA9">
+              <wp:anchor distT="0" distB="0" distL="114300" distR="114300" simplePos="0" relativeHeight="251659264" behindDoc="0" locked="0" layoutInCell="1" hidden="0" allowOverlap="1" wp14:anchorId="71D7C248" wp14:editId="12922981">
                 <wp:simplePos x="0" y="0"/>
                 <wp:positionH relativeFrom="column">
                   <wp:posOffset>456699</wp:posOffset>
@@ -627,7 +750,7 @@
                   <wp:posOffset>21082</wp:posOffset>
                 </wp:positionV>
                 <wp:extent cx="5935756" cy="2401829"/>
-                <wp:effectExtent l="0" t="0" r="0" b="0"/>
+                <wp:effectExtent l="0" t="0" r="18415" b="14605"/>
                 <wp:wrapNone/>
                 <wp:docPr id="829100411" name="Rectangle 829100411"/>
                 <wp:cNvGraphicFramePr/>
@@ -676,8 +799,31 @@
                           </w:p>
                           <w:p>
                             <w:pPr>
+                              <w:pStyle w:val="ListParagraph"/>
+                              <w:numPr>
+                                <w:ilvl w:val="0"/>
+                                <w:numId w:val="2"/>
+                              </w:numPr>
                               <w:textDirection w:val="btLr"/>
                             </w:pPr>
+                            <w:r>
+                              <w:rPr>
+                                <w:color w:val="000000"/>
+                              </w:rPr>
+                              <w:t>To utilise various cloud technologies to make the application as scalable and secure</w:t>
+                            </w:r>
+                            <w:r>
+                              <w:rPr>
+                                <w:color w:val="000000"/>
+                              </w:rPr>
+                              <w:t xml:space="preserve"> </w:t>
+                            </w:r>
+                            <w:r>
+                              <w:rPr>
+                                <w:color w:val="000000"/>
+                              </w:rPr>
+                              <w:t>as possible.</w:t>
+                            </w:r>
                           </w:p>
                           <w:p>
                             <w:pPr>
@@ -692,13 +838,20 @@
                               <w:rPr>
                                 <w:color w:val="000000"/>
                               </w:rPr>
-                              <w:t>To utilise various cloud technologies to make the application as scalable and secure as possible.</w:t>
-                            </w:r>
-                          </w:p>
-                          <w:p>
-                            <w:pPr>
-                              <w:textDirection w:val="btLr"/>
-                            </w:pPr>
+                              <w:t xml:space="preserve">To use automated testing to ensure speed, reliability and early </w:t>
+                            </w:r>
+                            <w:r>
+                              <w:rPr>
+                                <w:color w:val="000000"/>
+                              </w:rPr>
+                              <w:t>bug</w:t>
+                            </w:r>
+                            <w:r>
+                              <w:rPr>
+                                <w:color w:val="000000"/>
+                              </w:rPr>
+                              <w:t xml:space="preserve"> detection.</w:t>
+                            </w:r>
                           </w:p>
                           <w:p>
                             <w:pPr>
@@ -713,13 +866,8 @@
                               <w:rPr>
                                 <w:color w:val="000000"/>
                               </w:rPr>
-                              <w:t>To use automated testing to ensure speed, reliability and early big detection.</w:t>
-                            </w:r>
-                          </w:p>
-                          <w:p>
-                            <w:pPr>
-                              <w:textDirection w:val="btLr"/>
-                            </w:pPr>
+                              <w:t>To effectively use test driven development and CI/CD to verify all possible bugs are prevented.</w:t>
+                            </w:r>
                           </w:p>
                           <w:p>
                             <w:pPr>
@@ -728,14 +876,39 @@
                                 <w:ilvl w:val="0"/>
                                 <w:numId w:val="2"/>
                               </w:numPr>
+                            </w:pPr>
+                            <w:r>
+                              <w:t xml:space="preserve">To use external </w:t>
+                            </w:r>
+                            <w:r>
+                              <w:t xml:space="preserve">APIs </w:t>
+                            </w:r>
+                            <w:r>
+                              <w:t xml:space="preserve">to create personalised recommendations </w:t>
+                            </w:r>
+                            <w:r>
+                              <w:t xml:space="preserve">for </w:t>
+                            </w:r>
+                            <w:r>
+                              <w:t>the customer</w:t>
+                            </w:r>
+                            <w:r>
+                              <w:t xml:space="preserve"> so to </w:t>
+                            </w:r>
+                            <w:r>
+                              <w:t>utilise AI</w:t>
+                            </w:r>
+                            <w:r>
+                              <w:t xml:space="preserve"> technologies</w:t>
+                            </w:r>
+                            <w:r>
+                              <w:t>.</w:t>
+                            </w:r>
+                          </w:p>
+                          <w:p>
+                            <w:pPr>
                               <w:textDirection w:val="btLr"/>
                             </w:pPr>
-                            <w:r>
-                              <w:rPr>
-                                <w:color w:val="000000"/>
-                              </w:rPr>
-                              <w:t>To effectively use test driven development and CI/CD to verify all possible bugs are prevented.</w:t>
-                            </w:r>
                           </w:p>
                           <w:p>
                             <w:pPr>
@@ -755,7 +928,7 @@
           </mc:Choice>
           <mc:Fallback>
             <w:pict>
-              <v:rect w14:anchorId="71D7C248" id="Rectangle 829100411" o:spid="_x0000_s1027" style="position:absolute;margin-left:35.95pt;margin-top:1.65pt;width:467.4pt;height:189.1pt;z-index:251659264;visibility:visible;mso-wrap-style:square;mso-wrap-distance-left:9pt;mso-wrap-distance-top:0;mso-wrap-distance-right:9pt;mso-wrap-distance-bottom:0;mso-position-horizontal:absolute;mso-position-horizontal-relative:text;mso-position-vertical:absolute;mso-position-vertical-relative:text;v-text-anchor:top" o:gfxdata="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" fillcolor="white [3201]" strokecolor="#c00000">
+              <v:rect w14:anchorId="71D7C248" id="Rectangle 829100411" o:spid="_x0000_s1027" style="position:absolute;margin-left:35.95pt;margin-top:1.65pt;width:467.4pt;height:189.1pt;z-index:251659264;visibility:visible;mso-wrap-style:square;mso-wrap-distance-left:9pt;mso-wrap-distance-top:0;mso-wrap-distance-right:9pt;mso-wrap-distance-bottom:0;mso-position-horizontal:absolute;mso-position-horizontal-relative:text;mso-position-vertical:absolute;mso-position-vertical-relative:text;v-text-anchor:top" o:gfxdata="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" fillcolor="white [3201]" strokecolor="#c00000">
                 <v:stroke startarrowwidth="narrow" startarrowlength="short" endarrowwidth="narrow" endarrowlength="short" joinstyle="round"/>
                 <v:textbox inset="2.53958mm,1.2694mm,2.53958mm,1.2694mm">
                   <w:txbxContent>
@@ -777,8 +950,31 @@
                     </w:p>
                     <w:p>
                       <w:pPr>
+                        <w:pStyle w:val="ListParagraph"/>
+                        <w:numPr>
+                          <w:ilvl w:val="0"/>
+                          <w:numId w:val="2"/>
+                        </w:numPr>
                         <w:textDirection w:val="btLr"/>
                       </w:pPr>
+                      <w:r>
+                        <w:rPr>
+                          <w:color w:val="000000"/>
+                        </w:rPr>
+                        <w:t>To utilise various cloud technologies to make the application as scalable and secure</w:t>
+                      </w:r>
+                      <w:r>
+                        <w:rPr>
+                          <w:color w:val="000000"/>
+                        </w:rPr>
+                        <w:t xml:space="preserve"> </w:t>
+                      </w:r>
+                      <w:r>
+                        <w:rPr>
+                          <w:color w:val="000000"/>
+                        </w:rPr>
+                        <w:t>as possible.</w:t>
+                      </w:r>
                     </w:p>
                     <w:p>
                       <w:pPr>
@@ -793,13 +989,20 @@
                         <w:rPr>
                           <w:color w:val="000000"/>
                         </w:rPr>
-                        <w:t>To utilise various cloud technologies to make the application as scalable and secure as possible.</w:t>
-                      </w:r>
-                    </w:p>
-                    <w:p>
-                      <w:pPr>
-                        <w:textDirection w:val="btLr"/>
-                      </w:pPr>
+                        <w:t xml:space="preserve">To use automated testing to ensure speed, reliability and early </w:t>
+                      </w:r>
+                      <w:r>
+                        <w:rPr>
+                          <w:color w:val="000000"/>
+                        </w:rPr>
+                        <w:t>bug</w:t>
+                      </w:r>
+                      <w:r>
+                        <w:rPr>
+                          <w:color w:val="000000"/>
+                        </w:rPr>
+                        <w:t xml:space="preserve"> detection.</w:t>
+                      </w:r>
                     </w:p>
                     <w:p>
                       <w:pPr>
@@ -814,13 +1017,8 @@
                         <w:rPr>
                           <w:color w:val="000000"/>
                         </w:rPr>
-                        <w:t>To use automated testing to ensure speed, reliability and early big detection.</w:t>
-                      </w:r>
-                    </w:p>
-                    <w:p>
-                      <w:pPr>
-                        <w:textDirection w:val="btLr"/>
-                      </w:pPr>
+                        <w:t>To effectively use test driven development and CI/CD to verify all possible bugs are prevented.</w:t>
+                      </w:r>
                     </w:p>
                     <w:p>
                       <w:pPr>
@@ -829,14 +1027,39 @@
                           <w:ilvl w:val="0"/>
                           <w:numId w:val="2"/>
                         </w:numPr>
+                      </w:pPr>
+                      <w:r>
+                        <w:t xml:space="preserve">To use external </w:t>
+                      </w:r>
+                      <w:r>
+                        <w:t xml:space="preserve">APIs </w:t>
+                      </w:r>
+                      <w:r>
+                        <w:t xml:space="preserve">to create personalised recommendations </w:t>
+                      </w:r>
+                      <w:r>
+                        <w:t xml:space="preserve">for </w:t>
+                      </w:r>
+                      <w:r>
+                        <w:t>the customer</w:t>
+                      </w:r>
+                      <w:r>
+                        <w:t xml:space="preserve"> so to </w:t>
+                      </w:r>
+                      <w:r>
+                        <w:t>utilise AI</w:t>
+                      </w:r>
+                      <w:r>
+                        <w:t xml:space="preserve"> technologies</w:t>
+                      </w:r>
+                      <w:r>
+                        <w:t>.</w:t>
+                      </w:r>
+                    </w:p>
+                    <w:p>
+                      <w:pPr>
                         <w:textDirection w:val="btLr"/>
                       </w:pPr>
-                      <w:r>
-                        <w:rPr>
-                          <w:color w:val="000000"/>
-                        </w:rPr>
-                        <w:t>To effectively use test driven development and CI/CD to verify all possible bugs are prevented.</w:t>
-                      </w:r>
                     </w:p>
                     <w:p>
                       <w:pPr>
@@ -921,7 +1144,7 @@
         <mc:AlternateContent>
           <mc:Choice Requires="wps">
             <w:drawing>
-              <wp:anchor distT="0" distB="0" distL="114300" distR="114300" simplePos="0" relativeHeight="251660288" behindDoc="0" locked="0" layoutInCell="1" hidden="0" allowOverlap="1" wp14:anchorId="6481D8FF" wp14:editId="646E955D">
+              <wp:anchor distT="0" distB="0" distL="114300" distR="114300" simplePos="0" relativeHeight="251660288" behindDoc="0" locked="0" layoutInCell="1" hidden="0" allowOverlap="1" wp14:anchorId="6481D8FF" wp14:editId="4AD6B3A9">
                 <wp:simplePos x="0" y="0"/>
                 <wp:positionH relativeFrom="column">
                   <wp:posOffset>456698</wp:posOffset>
@@ -930,7 +1153,7 @@
                   <wp:posOffset>-7265</wp:posOffset>
                 </wp:positionV>
                 <wp:extent cx="5935345" cy="3048652"/>
-                <wp:effectExtent l="0" t="0" r="0" b="0"/>
+                <wp:effectExtent l="0" t="0" r="18415" b="10160"/>
                 <wp:wrapNone/>
                 <wp:docPr id="829100414" name="Rectangle 829100414"/>
                 <wp:cNvGraphicFramePr/>
@@ -980,7 +1203,13 @@
                               <w:rPr>
                                 <w:color w:val="000000"/>
                               </w:rPr>
-                              <w:t xml:space="preserve">Java with Spring Boot for multithreaded tasks for application efficiency </w:t>
+                              <w:t>Java with Spring Boot for multithreaded tasks for application efficiency</w:t>
+                            </w:r>
+                            <w:r>
+                              <w:rPr>
+                                <w:color w:val="000000"/>
+                              </w:rPr>
+                              <w:t>.</w:t>
                             </w:r>
                           </w:p>
                           <w:p>
@@ -1002,7 +1231,25 @@
                               <w:rPr>
                                 <w:color w:val="000000"/>
                               </w:rPr>
-                              <w:t xml:space="preserve">AWS S3 for secure storage </w:t>
+                              <w:t>AWS S3 for secure storage</w:t>
+                            </w:r>
+                            <w:r>
+                              <w:rPr>
+                                <w:color w:val="000000"/>
+                              </w:rPr>
+                              <w:t xml:space="preserve"> and</w:t>
+                            </w:r>
+                            <w:r>
+                              <w:rPr>
+                                <w:color w:val="000000"/>
+                              </w:rPr>
+                              <w:t xml:space="preserve"> </w:t>
+                            </w:r>
+                            <w:r>
+                              <w:rPr>
+                                <w:color w:val="000000"/>
+                              </w:rPr>
+                              <w:t>file delivery.</w:t>
                             </w:r>
                           </w:p>
                           <w:p>
@@ -1013,13 +1260,7 @@
                               <w:rPr>
                                 <w:color w:val="000000"/>
                               </w:rPr>
-                              <w:t>Azure</w:t>
-                            </w:r>
-                            <w:r>
-                              <w:rPr>
-                                <w:color w:val="000000"/>
-                              </w:rPr>
-                              <w:t xml:space="preserve"> for CI/CD to ensure code is tested and built during every commit.</w:t>
+                              <w:t>Azure for CI/CD to ensure code is tested and built during every commit.</w:t>
                             </w:r>
                           </w:p>
                           <w:p>
@@ -1054,23 +1295,21 @@
                                 <w:color w:val="000000"/>
                                 <w:shd w:val="clear" w:color="auto" w:fill="FFFFFE"/>
                               </w:rPr>
-                              <w:t xml:space="preserve">External APIs - </w:t>
-                            </w:r>
-                            <w:proofErr w:type="spellStart"/>
+                              <w:t xml:space="preserve">External APIs - PyTorch and ONNX Runtime for personalised </w:t>
+                            </w:r>
                             <w:r>
                               <w:rPr>
                                 <w:color w:val="000000"/>
                                 <w:shd w:val="clear" w:color="auto" w:fill="FFFFFE"/>
                               </w:rPr>
-                              <w:t>PyTorch</w:t>
-                            </w:r>
-                            <w:proofErr w:type="spellEnd"/>
+                              <w:t>recommendations</w:t>
+                            </w:r>
                             <w:r>
                               <w:rPr>
                                 <w:color w:val="000000"/>
                                 <w:shd w:val="clear" w:color="auto" w:fill="FFFFFE"/>
                               </w:rPr>
-                              <w:t xml:space="preserve"> and ONNX Runtime for personalised Recommendations, PayPal Sandbox API</w:t>
+                              <w:t>, PayPal Sandbox API</w:t>
                             </w:r>
                             <w:r>
                               <w:rPr>
@@ -1134,7 +1373,7 @@
           </mc:Choice>
           <mc:Fallback>
             <w:pict>
-              <v:rect w14:anchorId="6481D8FF" id="Rectangle 829100414" o:spid="_x0000_s1028" style="position:absolute;left:0;text-align:left;margin-left:35.95pt;margin-top:-.55pt;width:467.35pt;height:240.05pt;z-index:251660288;visibility:visible;mso-wrap-style:square;mso-wrap-distance-left:9pt;mso-wrap-distance-top:0;mso-wrap-distance-right:9pt;mso-wrap-distance-bottom:0;mso-position-horizontal:absolute;mso-position-horizontal-relative:text;mso-position-vertical:absolute;mso-position-vertical-relative:text;v-text-anchor:top" o:gfxdata="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" fillcolor="#fffffe">
+              <v:rect w14:anchorId="6481D8FF" id="Rectangle 829100414" o:spid="_x0000_s1028" style="position:absolute;left:0;text-align:left;margin-left:35.95pt;margin-top:-.55pt;width:467.35pt;height:240.05pt;z-index:251660288;visibility:visible;mso-wrap-style:square;mso-wrap-distance-left:9pt;mso-wrap-distance-top:0;mso-wrap-distance-right:9pt;mso-wrap-distance-bottom:0;mso-position-horizontal:absolute;mso-position-horizontal-relative:text;mso-position-vertical:absolute;mso-position-vertical-relative:text;v-text-anchor:top" o:gfxdata="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" fillcolor="#fffffe">
                 <v:stroke startarrowwidth="narrow" startarrowlength="short" endarrowwidth="narrow" endarrowlength="short" joinstyle="round"/>
                 <v:textbox inset="2.53958mm,1.2694mm,2.53958mm,1.2694mm">
                   <w:txbxContent>
@@ -1157,7 +1396,13 @@
                         <w:rPr>
                           <w:color w:val="000000"/>
                         </w:rPr>
-                        <w:t xml:space="preserve">Java with Spring Boot for multithreaded tasks for application efficiency </w:t>
+                        <w:t>Java with Spring Boot for multithreaded tasks for application efficiency</w:t>
+                      </w:r>
+                      <w:r>
+                        <w:rPr>
+                          <w:color w:val="000000"/>
+                        </w:rPr>
+                        <w:t>.</w:t>
                       </w:r>
                     </w:p>
                     <w:p>
@@ -1179,7 +1424,25 @@
                         <w:rPr>
                           <w:color w:val="000000"/>
                         </w:rPr>
-                        <w:t xml:space="preserve">AWS S3 for secure storage </w:t>
+                        <w:t>AWS S3 for secure storage</w:t>
+                      </w:r>
+                      <w:r>
+                        <w:rPr>
+                          <w:color w:val="000000"/>
+                        </w:rPr>
+                        <w:t xml:space="preserve"> and</w:t>
+                      </w:r>
+                      <w:r>
+                        <w:rPr>
+                          <w:color w:val="000000"/>
+                        </w:rPr>
+                        <w:t xml:space="preserve"> </w:t>
+                      </w:r>
+                      <w:r>
+                        <w:rPr>
+                          <w:color w:val="000000"/>
+                        </w:rPr>
+                        <w:t>file delivery.</w:t>
                       </w:r>
                     </w:p>
                     <w:p>
@@ -1190,13 +1453,7 @@
                         <w:rPr>
                           <w:color w:val="000000"/>
                         </w:rPr>
-                        <w:t>Azure</w:t>
-                      </w:r>
-                      <w:r>
-                        <w:rPr>
-                          <w:color w:val="000000"/>
-                        </w:rPr>
-                        <w:t xml:space="preserve"> for CI/CD to ensure code is tested and built during every commit.</w:t>
+                        <w:t>Azure for CI/CD to ensure code is tested and built during every commit.</w:t>
                       </w:r>
                     </w:p>
                     <w:p>
@@ -1231,23 +1488,21 @@
                           <w:color w:val="000000"/>
                           <w:shd w:val="clear" w:color="auto" w:fill="FFFFFE"/>
                         </w:rPr>
-                        <w:t xml:space="preserve">External APIs - </w:t>
-                      </w:r>
-                      <w:proofErr w:type="spellStart"/>
+                        <w:t xml:space="preserve">External APIs - PyTorch and ONNX Runtime for personalised </w:t>
+                      </w:r>
                       <w:r>
                         <w:rPr>
                           <w:color w:val="000000"/>
                           <w:shd w:val="clear" w:color="auto" w:fill="FFFFFE"/>
                         </w:rPr>
-                        <w:t>PyTorch</w:t>
-                      </w:r>
-                      <w:proofErr w:type="spellEnd"/>
+                        <w:t>recommendations</w:t>
+                      </w:r>
                       <w:r>
                         <w:rPr>
                           <w:color w:val="000000"/>
                           <w:shd w:val="clear" w:color="auto" w:fill="FFFFFE"/>
                         </w:rPr>
-                        <w:t xml:space="preserve"> and ONNX Runtime for personalised Recommendations, PayPal Sandbox API</w:t>
+                        <w:t>, PayPal Sandbox API</w:t>
                       </w:r>
                       <w:r>
                         <w:rPr>
@@ -1472,7 +1727,6 @@
           <w:b/>
           <w:color w:val="C00000"/>
         </w:rPr>
-        <w:lastRenderedPageBreak/>
         <w:t>Schedule of Work</w:t>
       </w:r>
     </w:p>
@@ -1592,7 +1846,7 @@
           </mc:Choice>
           <mc:Fallback>
             <w:pict>
-              <v:rect w14:anchorId="0164EBC1" id="Rectangle 829100413" o:spid="_x0000_s1029" style="position:absolute;left:0;text-align:left;margin-left:34.7pt;margin-top:23.35pt;width:462pt;height:366.75pt;z-index:251661312;visibility:visible;mso-wrap-style:none;mso-width-percent:0;mso-height-percent:0;mso-wrap-distance-left:9pt;mso-wrap-distance-top:0;mso-wrap-distance-right:9pt;mso-wrap-distance-bottom:0;mso-position-horizontal:absolute;mso-position-horizontal-relative:text;mso-position-vertical:absolute;mso-position-vertical-relative:text;mso-width-percent:0;mso-height-percent:0;mso-width-relative:margin;mso-height-relative:margin;v-text-anchor:top" o:gfxdata="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" fillcolor="white [3201]" strokecolor="#c00000">
+              <v:rect w14:anchorId="0164EBC1" id="Rectangle 829100413" o:spid="_x0000_s1029" style="position:absolute;left:0;text-align:left;margin-left:34.7pt;margin-top:23.35pt;width:462pt;height:366.75pt;z-index:251661312;visibility:visible;mso-wrap-style:none;mso-width-percent:0;mso-height-percent:0;mso-wrap-distance-left:9pt;mso-wrap-distance-top:0;mso-wrap-distance-right:9pt;mso-wrap-distance-bottom:0;mso-position-horizontal:absolute;mso-position-horizontal-relative:text;mso-position-vertical:absolute;mso-position-vertical-relative:text;mso-width-percent:0;mso-height-percent:0;mso-width-relative:margin;mso-height-relative:margin;v-text-anchor:top" o:gfxdata="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" fillcolor="white [3201]" strokecolor="#c00000">
                 <v:stroke startarrowwidth="narrow" startarrowlength="short" endarrowwidth="narrow" endarrowlength="short" joinstyle="round"/>
                 <v:textbox style="mso-fit-shape-to-text:t" inset="2.53958mm,1.2694mm,2.53958mm,1.2694mm">
                   <w:txbxContent>
@@ -1617,7 +1871,7 @@
                                     <pic:cNvPicPr/>
                                   </pic:nvPicPr>
                                   <pic:blipFill>
-                                    <a:blip r:embed="rId8"/>
+                                    <a:blip r:embed="rId9"/>
                                     <a:stretch>
                                       <a:fillRect/>
                                     </a:stretch>
@@ -1852,12 +2106,12 @@
       </w:pPr>
     </w:p>
     <w:sectPr>
-      <w:headerReference w:type="even" r:id="rId9"/>
-      <w:headerReference w:type="default" r:id="rId10"/>
-      <w:footerReference w:type="even" r:id="rId11"/>
-      <w:footerReference w:type="default" r:id="rId12"/>
-      <w:headerReference w:type="first" r:id="rId13"/>
-      <w:footerReference w:type="first" r:id="rId14"/>
+      <w:headerReference w:type="even" r:id="rId10"/>
+      <w:headerReference w:type="default" r:id="rId11"/>
+      <w:footerReference w:type="even" r:id="rId12"/>
+      <w:footerReference w:type="default" r:id="rId13"/>
+      <w:headerReference w:type="first" r:id="rId14"/>
+      <w:footerReference w:type="first" r:id="rId15"/>
       <w:pgSz w:w="11906" w:h="16838"/>
       <w:pgMar w:top="3515" w:right="851" w:bottom="3119" w:left="851" w:header="709" w:footer="709" w:gutter="0"/>
       <w:pgNumType w:start="1"/>
@@ -2095,6 +2349,119 @@
 <file path=word/numbering.xml><?xml version="1.0" encoding="utf-8"?>
 <w:numbering xmlns:wpc="http://schemas.microsoft.com/office/word/2010/wordprocessingCanvas" xmlns:cx="http://schemas.microsoft.com/office/drawing/2014/chartex" xmlns:cx1="http://schemas.microsoft.com/office/drawing/2015/9/8/chartex" xmlns:cx2="http://schemas.microsoft.com/office/drawing/2015/10/21/chartex" xmlns:cx3="http://schemas.microsoft.com/office/drawing/2016/5/9/chartex" xmlns:cx4="http://schemas.microsoft.com/office/drawing/2016/5/10/chartex" xmlns:cx5="http://schemas.microsoft.com/office/drawing/2016/5/11/chartex" xmlns:cx6="http://schemas.microsoft.com/office/drawing/2016/5/12/chartex" xmlns:cx7="http://schemas.microsoft.com/office/drawing/2016/5/13/chartex" xmlns:cx8="http://schemas.microsoft.com/office/drawing/2016/5/14/chartex" xmlns:mc="http://schemas.openxmlformats.org/markup-compatibility/2006" xmlns:aink="http://schemas.microsoft.com/office/drawing/2016/ink" xmlns:am3d="http://schemas.microsoft.com/office/drawing/2017/model3d" xmlns:o="urn:schemas-microsoft-com:office:office" xmlns:oel="http://schemas.microsoft.com/office/2019/extlst" xmlns:r="http://schemas.openxmlformats.org/officeDocument/2006/relationships" xmlns:m="http://schemas.openxmlformats.org/officeDocument/2006/math" xmlns:v="urn:schemas-microsoft-com:vml" xmlns:wp14="http://schemas.microsoft.com/office/word/2010/wordprocessingDrawing" xmlns:wp="http://schemas.openxmlformats.org/drawingml/2006/wordprocessingDrawing" xmlns:w10="urn:schemas-microsoft-com:office:word" xmlns:w="http://schemas.openxmlformats.org/wordprocessingml/2006/main" xmlns:w14="http://schemas.microsoft.com/office/word/2010/wordml" xmlns:w15="http://schemas.microsoft.com/office/word/2012/wordml" xmlns:w16cex="http://schemas.microsoft.com/office/word/2018/wordml/cex" xmlns:w16cid="http://schemas.microsoft.com/office/word/2016/wordml/cid" xmlns:w16="http://schemas.microsoft.com/office/word/2018/wordml" xmlns:w16du="http://schemas.microsoft.com/office/word/2023/wordml/word16du" xmlns:w16sdtdh="http://schemas.microsoft.com/office/word/2020/wordml/sdtdatahash" xmlns:w16sdtfl="http://schemas.microsoft.com/office/word/2024/wordml/sdtformatlock" xmlns:w16se="http://schemas.microsoft.com/office/word/2015/wordml/symex" xmlns:wpg="http://schemas.microsoft.com/office/word/2010/wordprocessingGroup" xmlns:wpi="http://schemas.microsoft.com/office/word/2010/wordprocessingInk" xmlns:wne="http://schemas.microsoft.com/office/word/2006/wordml" xmlns:wps="http://schemas.microsoft.com/office/word/2010/wordprocessingShape" mc:Ignorable="w14 w15 w16se w16cid w16 w16cex w16sdtdh w16sdtfl w16du wp14">
   <w:abstractNum w:abstractNumId="0" w15:restartNumberingAfterBreak="0">
+    <w:nsid w:val="2822498B"/>
+    <w:multiLevelType w:val="hybridMultilevel"/>
+    <w:tmpl w:val="242899A6"/>
+    <w:lvl w:ilvl="0" w:tplc="08090001">
+      <w:start w:val="1"/>
+      <w:numFmt w:val="bullet"/>
+      <w:lvlText w:val=""/>
+      <w:lvlJc w:val="left"/>
+      <w:pPr>
+        <w:ind w:left="740" w:hanging="360"/>
+      </w:pPr>
+      <w:rPr>
+        <w:rFonts w:ascii="Symbol" w:hAnsi="Symbol" w:hint="default"/>
+      </w:rPr>
+    </w:lvl>
+    <w:lvl w:ilvl="1" w:tplc="08090003" w:tentative="1">
+      <w:start w:val="1"/>
+      <w:numFmt w:val="bullet"/>
+      <w:lvlText w:val="o"/>
+      <w:lvlJc w:val="left"/>
+      <w:pPr>
+        <w:ind w:left="1460" w:hanging="360"/>
+      </w:pPr>
+      <w:rPr>
+        <w:rFonts w:ascii="Courier New" w:hAnsi="Courier New" w:cs="Courier New" w:hint="default"/>
+      </w:rPr>
+    </w:lvl>
+    <w:lvl w:ilvl="2" w:tplc="08090005" w:tentative="1">
+      <w:start w:val="1"/>
+      <w:numFmt w:val="bullet"/>
+      <w:lvlText w:val=""/>
+      <w:lvlJc w:val="left"/>
+      <w:pPr>
+        <w:ind w:left="2180" w:hanging="360"/>
+      </w:pPr>
+      <w:rPr>
+        <w:rFonts w:ascii="Wingdings" w:hAnsi="Wingdings" w:hint="default"/>
+      </w:rPr>
+    </w:lvl>
+    <w:lvl w:ilvl="3" w:tplc="08090001" w:tentative="1">
+      <w:start w:val="1"/>
+      <w:numFmt w:val="bullet"/>
+      <w:lvlText w:val=""/>
+      <w:lvlJc w:val="left"/>
+      <w:pPr>
+        <w:ind w:left="2900" w:hanging="360"/>
+      </w:pPr>
+      <w:rPr>
+        <w:rFonts w:ascii="Symbol" w:hAnsi="Symbol" w:hint="default"/>
+      </w:rPr>
+    </w:lvl>
+    <w:lvl w:ilvl="4" w:tplc="08090003" w:tentative="1">
+      <w:start w:val="1"/>
+      <w:numFmt w:val="bullet"/>
+      <w:lvlText w:val="o"/>
+      <w:lvlJc w:val="left"/>
+      <w:pPr>
+        <w:ind w:left="3620" w:hanging="360"/>
+      </w:pPr>
+      <w:rPr>
+        <w:rFonts w:ascii="Courier New" w:hAnsi="Courier New" w:cs="Courier New" w:hint="default"/>
+      </w:rPr>
+    </w:lvl>
+    <w:lvl w:ilvl="5" w:tplc="08090005" w:tentative="1">
+      <w:start w:val="1"/>
+      <w:numFmt w:val="bullet"/>
+      <w:lvlText w:val=""/>
+      <w:lvlJc w:val="left"/>
+      <w:pPr>
+        <w:ind w:left="4340" w:hanging="360"/>
+      </w:pPr>
+      <w:rPr>
+        <w:rFonts w:ascii="Wingdings" w:hAnsi="Wingdings" w:hint="default"/>
+      </w:rPr>
+    </w:lvl>
+    <w:lvl w:ilvl="6" w:tplc="08090001" w:tentative="1">
+      <w:start w:val="1"/>
+      <w:numFmt w:val="bullet"/>
+      <w:lvlText w:val=""/>
+      <w:lvlJc w:val="left"/>
+      <w:pPr>
+        <w:ind w:left="5060" w:hanging="360"/>
+      </w:pPr>
+      <w:rPr>
+        <w:rFonts w:ascii="Symbol" w:hAnsi="Symbol" w:hint="default"/>
+      </w:rPr>
+    </w:lvl>
+    <w:lvl w:ilvl="7" w:tplc="08090003" w:tentative="1">
+      <w:start w:val="1"/>
+      <w:numFmt w:val="bullet"/>
+      <w:lvlText w:val="o"/>
+      <w:lvlJc w:val="left"/>
+      <w:pPr>
+        <w:ind w:left="5780" w:hanging="360"/>
+      </w:pPr>
+      <w:rPr>
+        <w:rFonts w:ascii="Courier New" w:hAnsi="Courier New" w:cs="Courier New" w:hint="default"/>
+      </w:rPr>
+    </w:lvl>
+    <w:lvl w:ilvl="8" w:tplc="08090005" w:tentative="1">
+      <w:start w:val="1"/>
+      <w:numFmt w:val="bullet"/>
+      <w:lvlText w:val=""/>
+      <w:lvlJc w:val="left"/>
+      <w:pPr>
+        <w:ind w:left="6500" w:hanging="360"/>
+      </w:pPr>
+      <w:rPr>
+        <w:rFonts w:ascii="Wingdings" w:hAnsi="Wingdings" w:hint="default"/>
+      </w:rPr>
+    </w:lvl>
+  </w:abstractNum>
+  <w:abstractNum w:abstractNumId="1" w15:restartNumberingAfterBreak="0">
     <w:nsid w:val="59892806"/>
     <w:multiLevelType w:val="multilevel"/>
     <w:tmpl w:val="DA1E2F5E"/>
@@ -2180,10 +2547,10 @@
       </w:pPr>
     </w:lvl>
   </w:abstractNum>
-  <w:abstractNum w:abstractNumId="1" w15:restartNumberingAfterBreak="0">
+  <w:abstractNum w:abstractNumId="2" w15:restartNumberingAfterBreak="0">
     <w:nsid w:val="72CA7F6D"/>
     <w:multiLevelType w:val="hybridMultilevel"/>
-    <w:tmpl w:val="90882C0A"/>
+    <w:tmpl w:val="8F2C3340"/>
     <w:lvl w:ilvl="0" w:tplc="18090001">
       <w:start w:val="1"/>
       <w:numFmt w:val="bullet"/>
@@ -2294,10 +2661,13 @@
     </w:lvl>
   </w:abstractNum>
   <w:num w:numId="1" w16cid:durableId="543829890">
-    <w:abstractNumId w:val="0"/>
+    <w:abstractNumId w:val="1"/>
   </w:num>
   <w:num w:numId="2" w16cid:durableId="1123421894">
-    <w:abstractNumId w:val="1"/>
+    <w:abstractNumId w:val="2"/>
+  </w:num>
+  <w:num w:numId="3" w16cid:durableId="1170756450">
+    <w:abstractNumId w:val="0"/>
   </w:num>
 </w:numbering>
 </file>
@@ -3288,7 +3658,7 @@
 <ds:datastoreItem xmlns:ds="http://schemas.openxmlformats.org/officeDocument/2006/customXml" ds:itemID="{11111111-1234-1234-1234-123412341234}">
   <ds:schemaRefs>
     <ds:schemaRef ds:uri="http://customooxmlschemas.google.com/"/>
-    <ds:schemaRef ds:uri="http://schemas.openxmlformats.org/officeDocument/2006/relationships"/>
+    <ds:schemaRef ds:uri="http://www.w3.org/2000/xmlns/"/>
   </ds:schemaRefs>
 </ds:datastoreItem>
 </file>
</xml_diff>

<commit_message>
Gantt Chart updated for frontend work and project proposal updated for testing technologies to be used
</commit_message>
<xml_diff>
--- a/Game and Music Store Docs/sw4-FYP-ProjectProposal.docx
+++ b/Game and Music Store Docs/sw4-FYP-ProjectProposal.docx
@@ -389,13 +389,7 @@
                               <w:rPr>
                                 <w:color w:val="000000"/>
                               </w:rPr>
-                              <w:t xml:space="preserve"> manager will be able </w:t>
-                            </w:r>
-                            <w:r>
-                              <w:rPr>
-                                <w:color w:val="000000"/>
-                              </w:rPr>
-                              <w:t>to view available stock</w:t>
+                              <w:t xml:space="preserve"> manager will be able to view available stock</w:t>
                             </w:r>
                             <w:r>
                               <w:rPr>
@@ -495,7 +489,7 @@
           </mc:Choice>
           <mc:Fallback>
             <w:pict>
-              <v:rect w14:anchorId="4523B21D" id="Rectangle 829100412" o:spid="_x0000_s1026" style="position:absolute;margin-left:36.55pt;margin-top:4.95pt;width:474.65pt;height:327pt;z-index:251658240;visibility:visible;mso-wrap-style:square;mso-wrap-distance-left:9pt;mso-wrap-distance-top:0;mso-wrap-distance-right:9pt;mso-wrap-distance-bottom:0;mso-position-horizontal:absolute;mso-position-horizontal-relative:text;mso-position-vertical:absolute;mso-position-vertical-relative:text;v-text-anchor:top" o:gfxdata="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" fillcolor="white [3201]" strokecolor="#c00000">
+              <v:rect w14:anchorId="4523B21D" id="Rectangle 829100412" o:spid="_x0000_s1026" style="position:absolute;margin-left:36.55pt;margin-top:4.95pt;width:474.65pt;height:327pt;z-index:251658240;visibility:visible;mso-wrap-style:square;mso-wrap-distance-left:9pt;mso-wrap-distance-top:0;mso-wrap-distance-right:9pt;mso-wrap-distance-bottom:0;mso-position-horizontal:absolute;mso-position-horizontal-relative:text;mso-position-vertical:absolute;mso-position-vertical-relative:text;v-text-anchor:top" o:gfxdata="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" fillcolor="white [3201]" strokecolor="#c00000">
                 <v:stroke startarrowwidth="narrow" startarrowlength="short" endarrowwidth="narrow" endarrowlength="short" joinstyle="round"/>
                 <v:textbox inset="2.53958mm,1.2694mm,2.53958mm,1.2694mm">
                   <w:txbxContent>
@@ -714,6 +708,7 @@
           <w:b/>
           <w:color w:val="C00000"/>
         </w:rPr>
+        <w:lastRenderedPageBreak/>
         <w:t>Project Objectives</w:t>
       </w:r>
     </w:p>
@@ -928,7 +923,7 @@
           </mc:Choice>
           <mc:Fallback>
             <w:pict>
-              <v:rect w14:anchorId="71D7C248" id="Rectangle 829100411" o:spid="_x0000_s1027" style="position:absolute;margin-left:35.95pt;margin-top:1.65pt;width:467.4pt;height:189.1pt;z-index:251659264;visibility:visible;mso-wrap-style:square;mso-wrap-distance-left:9pt;mso-wrap-distance-top:0;mso-wrap-distance-right:9pt;mso-wrap-distance-bottom:0;mso-position-horizontal:absolute;mso-position-horizontal-relative:text;mso-position-vertical:absolute;mso-position-vertical-relative:text;v-text-anchor:top" o:gfxdata="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" fillcolor="white [3201]" strokecolor="#c00000">
+              <v:rect w14:anchorId="71D7C248" id="Rectangle 829100411" o:spid="_x0000_s1027" style="position:absolute;margin-left:35.95pt;margin-top:1.65pt;width:467.4pt;height:189.1pt;z-index:251659264;visibility:visible;mso-wrap-style:square;mso-wrap-distance-left:9pt;mso-wrap-distance-top:0;mso-wrap-distance-right:9pt;mso-wrap-distance-bottom:0;mso-position-horizontal:absolute;mso-position-horizontal-relative:text;mso-position-vertical:absolute;mso-position-vertical-relative:text;v-text-anchor:top" o:gfxdata="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" fillcolor="white [3201]" strokecolor="#c00000">
                 <v:stroke startarrowwidth="narrow" startarrowlength="short" endarrowwidth="narrow" endarrowlength="short" joinstyle="round"/>
                 <v:textbox inset="2.53958mm,1.2694mm,2.53958mm,1.2694mm">
                   <w:txbxContent>
@@ -1289,13 +1284,54 @@
                           <w:p>
                             <w:pPr>
                               <w:textDirection w:val="btLr"/>
+                              <w:rPr>
+                                <w:color w:val="000000"/>
+                                <w:shd w:val="clear" w:color="auto" w:fill="FFFFFE"/>
+                              </w:rPr>
                             </w:pPr>
                             <w:r>
                               <w:rPr>
                                 <w:color w:val="000000"/>
                                 <w:shd w:val="clear" w:color="auto" w:fill="FFFFFE"/>
                               </w:rPr>
-                              <w:t xml:space="preserve">External APIs - PyTorch and ONNX Runtime for personalised </w:t>
+                              <w:t xml:space="preserve">External APIs </w:t>
+                            </w:r>
+                            <w:r>
+                              <w:rPr>
+                                <w:color w:val="000000"/>
+                                <w:shd w:val="clear" w:color="auto" w:fill="FFFFFE"/>
+                              </w:rPr>
+                              <w:t>–</w:t>
+                            </w:r>
+                            <w:r>
+                              <w:rPr>
+                                <w:color w:val="000000"/>
+                                <w:shd w:val="clear" w:color="auto" w:fill="FFFFFE"/>
+                              </w:rPr>
+                              <w:t xml:space="preserve"> </w:t>
+                            </w:r>
+                            <w:proofErr w:type="spellStart"/>
+                            <w:r>
+                              <w:rPr>
+                                <w:color w:val="000000"/>
+                                <w:shd w:val="clear" w:color="auto" w:fill="FFFFFE"/>
+                              </w:rPr>
+                              <w:t>FastAPI</w:t>
+                            </w:r>
+                            <w:proofErr w:type="spellEnd"/>
+                            <w:r>
+                              <w:rPr>
+                                <w:color w:val="000000"/>
+                                <w:shd w:val="clear" w:color="auto" w:fill="FFFFFE"/>
+                              </w:rPr>
+                              <w:t xml:space="preserve"> </w:t>
+                            </w:r>
+                            <w:r>
+                              <w:rPr>
+                                <w:color w:val="000000"/>
+                                <w:shd w:val="clear" w:color="auto" w:fill="FFFFFE"/>
+                              </w:rPr>
+                              <w:t xml:space="preserve">for personalised </w:t>
                             </w:r>
                             <w:r>
                               <w:rPr>
@@ -1328,9 +1364,15 @@
                           </w:p>
                           <w:p>
                             <w:pPr>
-                              <w:spacing w:line="325" w:lineRule="auto"/>
                               <w:textDirection w:val="btLr"/>
                             </w:pPr>
+                            <w:r>
+                              <w:rPr>
+                                <w:color w:val="000000"/>
+                                <w:shd w:val="clear" w:color="auto" w:fill="FFFFFE"/>
+                              </w:rPr>
+                              <w:t>Testing – JUnit for unit and integration tests, JaCoCo for code coverage verification, and Postman for API testing.</w:t>
+                            </w:r>
                           </w:p>
                           <w:p>
                             <w:pPr>
@@ -1373,7 +1415,7 @@
           </mc:Choice>
           <mc:Fallback>
             <w:pict>
-              <v:rect w14:anchorId="6481D8FF" id="Rectangle 829100414" o:spid="_x0000_s1028" style="position:absolute;left:0;text-align:left;margin-left:35.95pt;margin-top:-.55pt;width:467.35pt;height:240.05pt;z-index:251660288;visibility:visible;mso-wrap-style:square;mso-wrap-distance-left:9pt;mso-wrap-distance-top:0;mso-wrap-distance-right:9pt;mso-wrap-distance-bottom:0;mso-position-horizontal:absolute;mso-position-horizontal-relative:text;mso-position-vertical:absolute;mso-position-vertical-relative:text;v-text-anchor:top" o:gfxdata="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" fillcolor="#fffffe">
+              <v:rect w14:anchorId="6481D8FF" id="Rectangle 829100414" o:spid="_x0000_s1028" style="position:absolute;left:0;text-align:left;margin-left:35.95pt;margin-top:-.55pt;width:467.35pt;height:240.05pt;z-index:251660288;visibility:visible;mso-wrap-style:square;mso-wrap-distance-left:9pt;mso-wrap-distance-top:0;mso-wrap-distance-right:9pt;mso-wrap-distance-bottom:0;mso-position-horizontal:absolute;mso-position-horizontal-relative:text;mso-position-vertical:absolute;mso-position-vertical-relative:text;v-text-anchor:top" o:gfxdata="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" fillcolor="#fffffe">
                 <v:stroke startarrowwidth="narrow" startarrowlength="short" endarrowwidth="narrow" endarrowlength="short" joinstyle="round"/>
                 <v:textbox inset="2.53958mm,1.2694mm,2.53958mm,1.2694mm">
                   <w:txbxContent>
@@ -1482,13 +1524,54 @@
                     <w:p>
                       <w:pPr>
                         <w:textDirection w:val="btLr"/>
+                        <w:rPr>
+                          <w:color w:val="000000"/>
+                          <w:shd w:val="clear" w:color="auto" w:fill="FFFFFE"/>
+                        </w:rPr>
                       </w:pPr>
                       <w:r>
                         <w:rPr>
                           <w:color w:val="000000"/>
                           <w:shd w:val="clear" w:color="auto" w:fill="FFFFFE"/>
                         </w:rPr>
-                        <w:t xml:space="preserve">External APIs - PyTorch and ONNX Runtime for personalised </w:t>
+                        <w:t xml:space="preserve">External APIs </w:t>
+                      </w:r>
+                      <w:r>
+                        <w:rPr>
+                          <w:color w:val="000000"/>
+                          <w:shd w:val="clear" w:color="auto" w:fill="FFFFFE"/>
+                        </w:rPr>
+                        <w:t>–</w:t>
+                      </w:r>
+                      <w:r>
+                        <w:rPr>
+                          <w:color w:val="000000"/>
+                          <w:shd w:val="clear" w:color="auto" w:fill="FFFFFE"/>
+                        </w:rPr>
+                        <w:t xml:space="preserve"> </w:t>
+                      </w:r>
+                      <w:proofErr w:type="spellStart"/>
+                      <w:r>
+                        <w:rPr>
+                          <w:color w:val="000000"/>
+                          <w:shd w:val="clear" w:color="auto" w:fill="FFFFFE"/>
+                        </w:rPr>
+                        <w:t>FastAPI</w:t>
+                      </w:r>
+                      <w:proofErr w:type="spellEnd"/>
+                      <w:r>
+                        <w:rPr>
+                          <w:color w:val="000000"/>
+                          <w:shd w:val="clear" w:color="auto" w:fill="FFFFFE"/>
+                        </w:rPr>
+                        <w:t xml:space="preserve"> </w:t>
+                      </w:r>
+                      <w:r>
+                        <w:rPr>
+                          <w:color w:val="000000"/>
+                          <w:shd w:val="clear" w:color="auto" w:fill="FFFFFE"/>
+                        </w:rPr>
+                        <w:t xml:space="preserve">for personalised </w:t>
                       </w:r>
                       <w:r>
                         <w:rPr>
@@ -1521,9 +1604,15 @@
                     </w:p>
                     <w:p>
                       <w:pPr>
-                        <w:spacing w:line="325" w:lineRule="auto"/>
                         <w:textDirection w:val="btLr"/>
                       </w:pPr>
+                      <w:r>
+                        <w:rPr>
+                          <w:color w:val="000000"/>
+                          <w:shd w:val="clear" w:color="auto" w:fill="FFFFFE"/>
+                        </w:rPr>
+                        <w:t>Testing – JUnit for unit and integration tests, JaCoCo for code coverage verification, and Postman for API testing.</w:t>
+                      </w:r>
                     </w:p>
                     <w:p>
                       <w:pPr>
@@ -1727,6 +1816,7 @@
           <w:b/>
           <w:color w:val="C00000"/>
         </w:rPr>
+        <w:lastRenderedPageBreak/>
         <w:t>Schedule of Work</w:t>
       </w:r>
     </w:p>
@@ -1736,6 +1826,22 @@
         <w:rPr>
           <w:sz w:val="20"/>
           <w:szCs w:val="20"/>
+        </w:rPr>
+      </w:pPr>
+      <w:r>
+        <w:rPr>
+          <w:sz w:val="20"/>
+          <w:szCs w:val="20"/>
+        </w:rPr>
+        <w:t>Using a Gantt chart or tabular format, outline your schedule of work for all the key project activities, deliverables and dates.</w:t>
+      </w:r>
+    </w:p>
+    <w:p>
+      <w:pPr>
+        <w:rPr>
+          <w:color w:val="201F1E"/>
+          <w:sz w:val="18"/>
+          <w:szCs w:val="18"/>
         </w:rPr>
       </w:pPr>
       <w:r>
@@ -1745,16 +1851,16 @@
         <mc:AlternateContent>
           <mc:Choice Requires="wps">
             <w:drawing>
-              <wp:anchor distT="0" distB="0" distL="114300" distR="114300" simplePos="0" relativeHeight="251661312" behindDoc="0" locked="0" layoutInCell="1" hidden="0" allowOverlap="1" wp14:anchorId="0164EBC1" wp14:editId="69531619">
+              <wp:anchor distT="0" distB="0" distL="114300" distR="114300" simplePos="0" relativeHeight="251661312" behindDoc="0" locked="0" layoutInCell="1" hidden="0" allowOverlap="1" wp14:anchorId="0164EBC1" wp14:editId="48C77590">
                 <wp:simplePos x="0" y="0"/>
-                <wp:positionH relativeFrom="column">
-                  <wp:posOffset>440691</wp:posOffset>
+                <wp:positionH relativeFrom="margin">
+                  <wp:align>right</wp:align>
                 </wp:positionH>
                 <wp:positionV relativeFrom="paragraph">
-                  <wp:posOffset>296545</wp:posOffset>
+                  <wp:posOffset>15240</wp:posOffset>
                 </wp:positionV>
                 <wp:extent cx="5867400" cy="4657725"/>
-                <wp:effectExtent l="0" t="0" r="19050" b="28575"/>
+                <wp:effectExtent l="0" t="0" r="26670" b="13970"/>
                 <wp:wrapNone/>
                 <wp:docPr id="829100413" name="Rectangle 829100413"/>
                 <wp:cNvGraphicFramePr/>
@@ -1791,10 +1897,10 @@
                                 <w:noProof/>
                               </w:rPr>
                               <w:drawing>
-                                <wp:inline distT="0" distB="0" distL="0" distR="0" wp14:anchorId="505CCDB6" wp14:editId="3E5F182C">
-                                  <wp:extent cx="6073140" cy="6479540"/>
-                                  <wp:effectExtent l="0" t="0" r="3810" b="0"/>
-                                  <wp:docPr id="594135529" name="Picture 1" descr="A screenshot of a calendar&#10;&#10;AI-generated content may be incorrect."/>
+                                <wp:inline distT="0" distB="0" distL="0" distR="0" wp14:anchorId="24BA7B25" wp14:editId="5247802A">
+                                  <wp:extent cx="6332351" cy="4972050"/>
+                                  <wp:effectExtent l="0" t="0" r="0" b="0"/>
+                                  <wp:docPr id="1617359628" name="Picture 1" descr="A screenshot of a computer&#10;&#10;AI-generated content may be incorrect."/>
                                   <wp:cNvGraphicFramePr>
                                     <a:graphicFrameLocks xmlns:a="http://schemas.openxmlformats.org/drawingml/2006/main" noChangeAspect="1"/>
                                   </wp:cNvGraphicFramePr>
@@ -1802,7 +1908,7 @@
                                     <a:graphicData uri="http://schemas.openxmlformats.org/drawingml/2006/picture">
                                       <pic:pic xmlns:pic="http://schemas.openxmlformats.org/drawingml/2006/picture">
                                         <pic:nvPicPr>
-                                          <pic:cNvPr id="594135529" name="Picture 1" descr="A screenshot of a calendar&#10;&#10;AI-generated content may be incorrect."/>
+                                          <pic:cNvPr id="802633079" name="Picture 1" descr="A screenshot of a computer&#10;&#10;AI-generated content may be incorrect."/>
                                           <pic:cNvPicPr/>
                                         </pic:nvPicPr>
                                         <pic:blipFill>
@@ -1814,7 +1920,7 @@
                                         <pic:spPr>
                                           <a:xfrm>
                                             <a:off x="0" y="0"/>
-                                            <a:ext cx="6073140" cy="6479540"/>
+                                            <a:ext cx="6335097" cy="4974206"/>
                                           </a:xfrm>
                                           <a:prstGeom prst="rect">
                                             <a:avLst/>
@@ -1846,7 +1952,7 @@
           </mc:Choice>
           <mc:Fallback>
             <w:pict>
-              <v:rect w14:anchorId="0164EBC1" id="Rectangle 829100413" o:spid="_x0000_s1029" style="position:absolute;left:0;text-align:left;margin-left:34.7pt;margin-top:23.35pt;width:462pt;height:366.75pt;z-index:251661312;visibility:visible;mso-wrap-style:none;mso-width-percent:0;mso-height-percent:0;mso-wrap-distance-left:9pt;mso-wrap-distance-top:0;mso-wrap-distance-right:9pt;mso-wrap-distance-bottom:0;mso-position-horizontal:absolute;mso-position-horizontal-relative:text;mso-position-vertical:absolute;mso-position-vertical-relative:text;mso-width-percent:0;mso-height-percent:0;mso-width-relative:margin;mso-height-relative:margin;v-text-anchor:top" o:gfxdata="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" fillcolor="white [3201]" strokecolor="#c00000">
+              <v:rect w14:anchorId="0164EBC1" id="Rectangle 829100413" o:spid="_x0000_s1029" style="position:absolute;margin-left:410.8pt;margin-top:1.2pt;width:462pt;height:366.75pt;z-index:251661312;visibility:visible;mso-wrap-style:none;mso-width-percent:0;mso-height-percent:0;mso-wrap-distance-left:9pt;mso-wrap-distance-top:0;mso-wrap-distance-right:9pt;mso-wrap-distance-bottom:0;mso-position-horizontal:right;mso-position-horizontal-relative:margin;mso-position-vertical:absolute;mso-position-vertical-relative:text;mso-width-percent:0;mso-height-percent:0;mso-width-relative:margin;mso-height-relative:margin;v-text-anchor:top" o:gfxdata="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" fillcolor="white [3201]" strokecolor="#c00000">
                 <v:stroke startarrowwidth="narrow" startarrowlength="short" endarrowwidth="narrow" endarrowlength="short" joinstyle="round"/>
                 <v:textbox style="mso-fit-shape-to-text:t" inset="2.53958mm,1.2694mm,2.53958mm,1.2694mm">
                   <w:txbxContent>
@@ -1856,10 +1962,10 @@
                           <w:noProof/>
                         </w:rPr>
                         <w:drawing>
-                          <wp:inline distT="0" distB="0" distL="0" distR="0" wp14:anchorId="505CCDB6" wp14:editId="3E5F182C">
-                            <wp:extent cx="6073140" cy="6479540"/>
-                            <wp:effectExtent l="0" t="0" r="3810" b="0"/>
-                            <wp:docPr id="594135529" name="Picture 1" descr="A screenshot of a calendar&#10;&#10;AI-generated content may be incorrect."/>
+                          <wp:inline distT="0" distB="0" distL="0" distR="0" wp14:anchorId="24BA7B25" wp14:editId="5247802A">
+                            <wp:extent cx="6332351" cy="4972050"/>
+                            <wp:effectExtent l="0" t="0" r="0" b="0"/>
+                            <wp:docPr id="1617359628" name="Picture 1" descr="A screenshot of a computer&#10;&#10;AI-generated content may be incorrect."/>
                             <wp:cNvGraphicFramePr>
                               <a:graphicFrameLocks xmlns:a="http://schemas.openxmlformats.org/drawingml/2006/main" noChangeAspect="1"/>
                             </wp:cNvGraphicFramePr>
@@ -1867,11 +1973,11 @@
                               <a:graphicData uri="http://schemas.openxmlformats.org/drawingml/2006/picture">
                                 <pic:pic xmlns:pic="http://schemas.openxmlformats.org/drawingml/2006/picture">
                                   <pic:nvPicPr>
-                                    <pic:cNvPr id="594135529" name="Picture 1" descr="A screenshot of a calendar&#10;&#10;AI-generated content may be incorrect."/>
+                                    <pic:cNvPr id="802633079" name="Picture 1" descr="A screenshot of a computer&#10;&#10;AI-generated content may be incorrect."/>
                                     <pic:cNvPicPr/>
                                   </pic:nvPicPr>
                                   <pic:blipFill>
-                                    <a:blip r:embed="rId9"/>
+                                    <a:blip r:embed="rId8"/>
                                     <a:stretch>
                                       <a:fillRect/>
                                     </a:stretch>
@@ -1879,7 +1985,7 @@
                                   <pic:spPr>
                                     <a:xfrm>
                                       <a:off x="0" y="0"/>
-                                      <a:ext cx="6073140" cy="6479540"/>
+                                      <a:ext cx="6335097" cy="4974206"/>
                                     </a:xfrm>
                                     <a:prstGeom prst="rect">
                                       <a:avLst/>
@@ -1894,18 +2000,12 @@
                     </w:p>
                   </w:txbxContent>
                 </v:textbox>
+                <w10:wrap anchorx="margin"/>
               </v:rect>
             </w:pict>
           </mc:Fallback>
         </mc:AlternateContent>
       </w:r>
-      <w:r>
-        <w:rPr>
-          <w:sz w:val="20"/>
-          <w:szCs w:val="20"/>
-        </w:rPr>
-        <w:t>Using a Gantt chart or tabular format, outline your schedule of work for all the key project activities, deliverables and dates.</w:t>
-      </w:r>
     </w:p>
     <w:p>
       <w:pPr>
@@ -2096,22 +2196,13 @@
         </w:rPr>
       </w:pPr>
     </w:p>
-    <w:p>
-      <w:pPr>
-        <w:rPr>
-          <w:color w:val="201F1E"/>
-          <w:sz w:val="18"/>
-          <w:szCs w:val="18"/>
-        </w:rPr>
-      </w:pPr>
-    </w:p>
     <w:sectPr>
-      <w:headerReference w:type="even" r:id="rId10"/>
-      <w:headerReference w:type="default" r:id="rId11"/>
-      <w:footerReference w:type="even" r:id="rId12"/>
-      <w:footerReference w:type="default" r:id="rId13"/>
-      <w:headerReference w:type="first" r:id="rId14"/>
-      <w:footerReference w:type="first" r:id="rId15"/>
+      <w:headerReference w:type="even" r:id="rId9"/>
+      <w:headerReference w:type="default" r:id="rId10"/>
+      <w:footerReference w:type="even" r:id="rId11"/>
+      <w:footerReference w:type="default" r:id="rId12"/>
+      <w:headerReference w:type="first" r:id="rId13"/>
+      <w:footerReference w:type="first" r:id="rId14"/>
       <w:pgSz w:w="11906" w:h="16838"/>
       <w:pgMar w:top="3515" w:right="851" w:bottom="3119" w:left="851" w:header="709" w:footer="709" w:gutter="0"/>
       <w:pgNumType w:start="1"/>
@@ -3658,7 +3749,7 @@
 <ds:datastoreItem xmlns:ds="http://schemas.openxmlformats.org/officeDocument/2006/customXml" ds:itemID="{11111111-1234-1234-1234-123412341234}">
   <ds:schemaRefs>
     <ds:schemaRef ds:uri="http://customooxmlschemas.google.com/"/>
-    <ds:schemaRef ds:uri="http://www.w3.org/2000/xmlns/"/>
+    <ds:schemaRef ds:uri="http://schemas.openxmlformats.org/officeDocument/2006/relationships"/>
   </ds:schemaRefs>
 </ds:datastoreItem>
 </file>
</xml_diff>

<commit_message>
Gantt Chart deliverable start, end dates and duration updated and inserted in proposal
</commit_message>
<xml_diff>
--- a/Game and Music Store Docs/sw4-FYP-ProjectProposal.docx
+++ b/Game and Music Store Docs/sw4-FYP-ProjectProposal.docx
@@ -99,7 +99,27 @@
           <w:sz w:val="22"/>
           <w:szCs w:val="22"/>
         </w:rPr>
-        <w:t>Each student must complete the following form and submit it to their supervisor for consideration. Once your supervisor has signed-off on the proposal, you must submit the document for consideration using Moodle.</w:t>
+        <w:t xml:space="preserve">Each student must complete the following form and submit it to their supervisor for consideration. Once your supervisor has </w:t>
+      </w:r>
+      <w:proofErr w:type="gramStart"/>
+      <w:r>
+        <w:rPr>
+          <w:b/>
+          <w:color w:val="0432FF"/>
+          <w:sz w:val="22"/>
+          <w:szCs w:val="22"/>
+        </w:rPr>
+        <w:t>signed-off</w:t>
+      </w:r>
+      <w:proofErr w:type="gramEnd"/>
+      <w:r>
+        <w:rPr>
+          <w:b/>
+          <w:color w:val="0432FF"/>
+          <w:sz w:val="22"/>
+          <w:szCs w:val="22"/>
+        </w:rPr>
+        <w:t xml:space="preserve"> on the proposal, you must submit the document for consideration using Moodle.</w:t>
       </w:r>
     </w:p>
     <w:p>
@@ -489,7 +509,7 @@
           </mc:Choice>
           <mc:Fallback>
             <w:pict>
-              <v:rect w14:anchorId="4523B21D" id="Rectangle 829100412" o:spid="_x0000_s1026" style="position:absolute;margin-left:36.55pt;margin-top:4.95pt;width:474.65pt;height:327pt;z-index:251658240;visibility:visible;mso-wrap-style:square;mso-wrap-distance-left:9pt;mso-wrap-distance-top:0;mso-wrap-distance-right:9pt;mso-wrap-distance-bottom:0;mso-position-horizontal:absolute;mso-position-horizontal-relative:text;mso-position-vertical:absolute;mso-position-vertical-relative:text;v-text-anchor:top" o:gfxdata="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" fillcolor="white [3201]" strokecolor="#c00000">
+              <v:rect w14:anchorId="4523B21D" id="Rectangle 829100412" o:spid="_x0000_s1026" style="position:absolute;margin-left:36.55pt;margin-top:4.95pt;width:474.65pt;height:327pt;z-index:251658240;visibility:visible;mso-wrap-style:square;mso-wrap-distance-left:9pt;mso-wrap-distance-top:0;mso-wrap-distance-right:9pt;mso-wrap-distance-bottom:0;mso-position-horizontal:absolute;mso-position-horizontal-relative:text;mso-position-vertical:absolute;mso-position-vertical-relative:text;v-text-anchor:top" o:gfxdata="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" fillcolor="white [3201]" strokecolor="#c00000">
                 <v:stroke startarrowwidth="narrow" startarrowlength="short" endarrowwidth="narrow" endarrowlength="short" joinstyle="round"/>
                 <v:textbox inset="2.53958mm,1.2694mm,2.53958mm,1.2694mm">
                   <w:txbxContent>
@@ -567,13 +587,7 @@
                         <w:rPr>
                           <w:color w:val="000000"/>
                         </w:rPr>
-                        <w:t xml:space="preserve"> manager will be able </w:t>
-                      </w:r>
-                      <w:r>
-                        <w:rPr>
-                          <w:color w:val="000000"/>
-                        </w:rPr>
-                        <w:t>to view available stock</w:t>
+                        <w:t xml:space="preserve"> manager will be able to view available stock</w:t>
                       </w:r>
                       <w:r>
                         <w:rPr>
@@ -923,7 +937,7 @@
           </mc:Choice>
           <mc:Fallback>
             <w:pict>
-              <v:rect w14:anchorId="71D7C248" id="Rectangle 829100411" o:spid="_x0000_s1027" style="position:absolute;margin-left:35.95pt;margin-top:1.65pt;width:467.4pt;height:189.1pt;z-index:251659264;visibility:visible;mso-wrap-style:square;mso-wrap-distance-left:9pt;mso-wrap-distance-top:0;mso-wrap-distance-right:9pt;mso-wrap-distance-bottom:0;mso-position-horizontal:absolute;mso-position-horizontal-relative:text;mso-position-vertical:absolute;mso-position-vertical-relative:text;v-text-anchor:top" o:gfxdata="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" fillcolor="white [3201]" strokecolor="#c00000">
+              <v:rect w14:anchorId="71D7C248" id="Rectangle 829100411" o:spid="_x0000_s1027" style="position:absolute;margin-left:35.95pt;margin-top:1.65pt;width:467.4pt;height:189.1pt;z-index:251659264;visibility:visible;mso-wrap-style:square;mso-wrap-distance-left:9pt;mso-wrap-distance-top:0;mso-wrap-distance-right:9pt;mso-wrap-distance-bottom:0;mso-position-horizontal:absolute;mso-position-horizontal-relative:text;mso-position-vertical:absolute;mso-position-vertical-relative:text;v-text-anchor:top" o:gfxdata="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" fillcolor="white [3201]" strokecolor="#c00000">
                 <v:stroke startarrowwidth="narrow" startarrowlength="short" endarrowwidth="narrow" endarrowlength="short" joinstyle="round"/>
                 <v:textbox inset="2.53958mm,1.2694mm,2.53958mm,1.2694mm">
                   <w:txbxContent>
@@ -1851,7 +1865,7 @@
         <mc:AlternateContent>
           <mc:Choice Requires="wps">
             <w:drawing>
-              <wp:anchor distT="0" distB="0" distL="114300" distR="114300" simplePos="0" relativeHeight="251661312" behindDoc="0" locked="0" layoutInCell="1" hidden="0" allowOverlap="1" wp14:anchorId="0164EBC1" wp14:editId="48C77590">
+              <wp:anchor distT="0" distB="0" distL="114300" distR="114300" simplePos="0" relativeHeight="251661312" behindDoc="0" locked="0" layoutInCell="1" hidden="0" allowOverlap="1" wp14:anchorId="0164EBC1" wp14:editId="578398D8">
                 <wp:simplePos x="0" y="0"/>
                 <wp:positionH relativeFrom="margin">
                   <wp:align>right</wp:align>
@@ -1892,15 +1906,18 @@
                       <wps:txbx>
                         <w:txbxContent>
                           <w:p>
+                            <w:pPr>
+                              <w:ind w:left="7200" w:hanging="7200"/>
+                            </w:pPr>
                             <w:r>
                               <w:rPr>
                                 <w:noProof/>
                               </w:rPr>
                               <w:drawing>
-                                <wp:inline distT="0" distB="0" distL="0" distR="0" wp14:anchorId="24BA7B25" wp14:editId="5247802A">
-                                  <wp:extent cx="6332351" cy="4972050"/>
+                                <wp:inline distT="0" distB="0" distL="0" distR="0" wp14:anchorId="6136D4FE" wp14:editId="3E32F2DD">
+                                  <wp:extent cx="6305967" cy="5029200"/>
                                   <wp:effectExtent l="0" t="0" r="0" b="0"/>
-                                  <wp:docPr id="1617359628" name="Picture 1" descr="A screenshot of a computer&#10;&#10;AI-generated content may be incorrect."/>
+                                  <wp:docPr id="480275399" name="Picture 1" descr="A screenshot of a calendar&#10;&#10;AI-generated content may be incorrect."/>
                                   <wp:cNvGraphicFramePr>
                                     <a:graphicFrameLocks xmlns:a="http://schemas.openxmlformats.org/drawingml/2006/main" noChangeAspect="1"/>
                                   </wp:cNvGraphicFramePr>
@@ -1908,7 +1925,7 @@
                                     <a:graphicData uri="http://schemas.openxmlformats.org/drawingml/2006/picture">
                                       <pic:pic xmlns:pic="http://schemas.openxmlformats.org/drawingml/2006/picture">
                                         <pic:nvPicPr>
-                                          <pic:cNvPr id="802633079" name="Picture 1" descr="A screenshot of a computer&#10;&#10;AI-generated content may be incorrect."/>
+                                          <pic:cNvPr id="480275399" name="Picture 1" descr="A screenshot of a calendar&#10;&#10;AI-generated content may be incorrect."/>
                                           <pic:cNvPicPr/>
                                         </pic:nvPicPr>
                                         <pic:blipFill>
@@ -1920,7 +1937,7 @@
                                         <pic:spPr>
                                           <a:xfrm>
                                             <a:off x="0" y="0"/>
-                                            <a:ext cx="6335097" cy="4974206"/>
+                                            <a:ext cx="6315478" cy="5036785"/>
                                           </a:xfrm>
                                           <a:prstGeom prst="rect">
                                             <a:avLst/>
@@ -1957,15 +1974,18 @@
                 <v:textbox style="mso-fit-shape-to-text:t" inset="2.53958mm,1.2694mm,2.53958mm,1.2694mm">
                   <w:txbxContent>
                     <w:p>
+                      <w:pPr>
+                        <w:ind w:left="7200" w:hanging="7200"/>
+                      </w:pPr>
                       <w:r>
                         <w:rPr>
                           <w:noProof/>
                         </w:rPr>
                         <w:drawing>
-                          <wp:inline distT="0" distB="0" distL="0" distR="0" wp14:anchorId="24BA7B25" wp14:editId="5247802A">
-                            <wp:extent cx="6332351" cy="4972050"/>
+                          <wp:inline distT="0" distB="0" distL="0" distR="0" wp14:anchorId="6136D4FE" wp14:editId="3E32F2DD">
+                            <wp:extent cx="6305967" cy="5029200"/>
                             <wp:effectExtent l="0" t="0" r="0" b="0"/>
-                            <wp:docPr id="1617359628" name="Picture 1" descr="A screenshot of a computer&#10;&#10;AI-generated content may be incorrect."/>
+                            <wp:docPr id="480275399" name="Picture 1" descr="A screenshot of a calendar&#10;&#10;AI-generated content may be incorrect."/>
                             <wp:cNvGraphicFramePr>
                               <a:graphicFrameLocks xmlns:a="http://schemas.openxmlformats.org/drawingml/2006/main" noChangeAspect="1"/>
                             </wp:cNvGraphicFramePr>
@@ -1973,7 +1993,7 @@
                               <a:graphicData uri="http://schemas.openxmlformats.org/drawingml/2006/picture">
                                 <pic:pic xmlns:pic="http://schemas.openxmlformats.org/drawingml/2006/picture">
                                   <pic:nvPicPr>
-                                    <pic:cNvPr id="802633079" name="Picture 1" descr="A screenshot of a computer&#10;&#10;AI-generated content may be incorrect."/>
+                                    <pic:cNvPr id="480275399" name="Picture 1" descr="A screenshot of a calendar&#10;&#10;AI-generated content may be incorrect."/>
                                     <pic:cNvPicPr/>
                                   </pic:nvPicPr>
                                   <pic:blipFill>
@@ -1985,7 +2005,7 @@
                                   <pic:spPr>
                                     <a:xfrm>
                                       <a:off x="0" y="0"/>
-                                      <a:ext cx="6335097" cy="4974206"/>
+                                      <a:ext cx="6315478" cy="5036785"/>
                                     </a:xfrm>
                                     <a:prstGeom prst="rect">
                                       <a:avLst/>

</xml_diff>